<commit_message>
Use official Takushoku admission-policy wording in the worksheets
Read directly from takudai.jp and takushoku-u.ac.jp (2027 entrance
version). Sheet sections 1-1 to 1-3 and STEP 2 items now quote the
original text; slide material and model-answer quotes match it.

Co-Authored-By: Claude Opus 5.5 <noreply@anthropic.com>
Claude-Session: https://claude.ai/code/session_018XciJJW37X4j1Si7AWU6FS
</commit_message>
<xml_diff>
--- a/小論文添削（ショー）/ワークシート/拓殖大学_政経学部法律政治学科/拓殖大学_政経学部法律政治学科_作文記入シート.docx
+++ b/小論文添削（ショー）/ワークシート/拓殖大学_政経学部法律政治学科/拓殖大学_政経学部法律政治学科_作文記入シート.docx
@@ -649,25 +649,7 @@
                 <w:sz w:val="21"/>
                 <w:szCs w:val="21"/>
               </w:rPr>
-              <w:t xml:space="preserve">1900年、桂太郎が「台湾協会学校」として創立。受け継がれてきた「</w:t>
-            </w:r>
-            <w:r>
-              <w:rPr>
-                <w:rFonts w:ascii="游明朝" w:cs="游明朝" w:eastAsia="游明朝" w:hAnsi="游明朝"/>
-                <w:b/>
-                <w:bCs/>
-                <w:sz w:val="21"/>
-                <w:szCs w:val="21"/>
-              </w:rPr>
-              <w:t xml:space="preserve">開拓の精神</w:t>
-            </w:r>
-            <w:r>
-              <w:rPr>
-                <w:rFonts w:ascii="游明朝" w:cs="游明朝" w:eastAsia="游明朝" w:hAnsi="游明朝"/>
-                <w:sz w:val="21"/>
-                <w:szCs w:val="21"/>
-              </w:rPr>
-              <w:t xml:space="preserve">」</w:t>
+              <w:t xml:space="preserve">1900（明治33）年、台湾協会学校として創立。初代校長は桂太郎。</w:t>
             </w:r>
           </w:p>
           <w:p>
@@ -685,7 +667,7 @@
                 <w:sz w:val="21"/>
                 <w:szCs w:val="21"/>
               </w:rPr>
-              <w:t xml:space="preserve">「</w:t>
+              <w:t xml:space="preserve">建学の理念：「</w:t>
             </w:r>
             <w:r>
               <w:rPr>
@@ -723,7 +705,7 @@
                 <w:sz w:val="21"/>
                 <w:szCs w:val="21"/>
               </w:rPr>
-              <w:t xml:space="preserve">を具えた有為な人材の育成」</w:t>
+              <w:t xml:space="preserve">を具えた有為の人材の育成」</w:t>
             </w:r>
           </w:p>
           <w:p>
@@ -741,7 +723,7 @@
                 <w:sz w:val="21"/>
                 <w:szCs w:val="21"/>
               </w:rPr>
-              <w:t xml:space="preserve">現在の言い方：「</w:t>
+              <w:t xml:space="preserve">めざす人材：「学生一人ひとりが</w:t>
             </w:r>
             <w:r>
               <w:rPr>
@@ -769,7 +751,7 @@
                 <w:sz w:val="21"/>
                 <w:szCs w:val="21"/>
               </w:rPr>
-              <w:t xml:space="preserve">何事にも積極的にチャレンジ</w:t>
+              <w:t xml:space="preserve">国内外の人々と協働して積極的に課題の発見と解決にチャレンジ</w:t>
             </w:r>
             <w:r>
               <w:rPr>
@@ -777,7 +759,7 @@
                 <w:sz w:val="21"/>
                 <w:szCs w:val="21"/>
               </w:rPr>
-              <w:t xml:space="preserve">し、</w:t>
+              <w:t xml:space="preserve">していくタフな人間力を身につけたグローバル人材（『</w:t>
             </w:r>
             <w:r>
               <w:rPr>
@@ -787,7 +769,7 @@
                 <w:sz w:val="21"/>
                 <w:szCs w:val="21"/>
               </w:rPr>
-              <w:t xml:space="preserve">国内外の人と協働して問題を解決</w:t>
+              <w:t xml:space="preserve">拓殖人材</w:t>
             </w:r>
             <w:r>
               <w:rPr>
@@ -795,7 +777,25 @@
                 <w:sz w:val="21"/>
                 <w:szCs w:val="21"/>
               </w:rPr>
-              <w:t xml:space="preserve">できるタフな人間力を持った人材（＝</w:t>
+              <w:t xml:space="preserve">』）」</w:t>
+            </w:r>
+          </w:p>
+          <w:p>
+            <w:pPr>
+              <w:pStyle w:val="ListParagraph"/>
+              <w:numPr>
+                <w:ilvl w:val="0"/>
+                <w:numId w:val="2"/>
+              </w:numPr>
+              <w:spacing w:after="40" w:line="300"/>
+            </w:pPr>
+            <w:r>
+              <w:rPr>
+                <w:rFonts w:ascii="游明朝" w:cs="游明朝" w:eastAsia="游明朝" w:hAnsi="游明朝"/>
+                <w:sz w:val="21"/>
+                <w:szCs w:val="21"/>
+              </w:rPr>
+              <w:t xml:space="preserve">政経学部での受け継ぎ方：建学の理念は「外国語と法律学・政治学・経済学の知識を基盤に、将来的に国や組織が直面する課題について、</w:t>
             </w:r>
             <w:r>
               <w:rPr>
@@ -805,7 +805,7 @@
                 <w:sz w:val="21"/>
                 <w:szCs w:val="21"/>
               </w:rPr>
-              <w:t xml:space="preserve">拓殖人材</w:t>
+              <w:t xml:space="preserve">現場で人々と協働して具体的な解決策を模索し、その実現を図っていく姿勢</w:t>
             </w:r>
             <w:r>
               <w:rPr>
@@ -813,7 +813,7 @@
                 <w:sz w:val="21"/>
                 <w:szCs w:val="21"/>
               </w:rPr>
-              <w:t xml:space="preserve">）」</w:t>
+              <w:t xml:space="preserve">として受け継がれて来た」</w:t>
             </w:r>
           </w:p>
         </w:tc>
@@ -836,7 +836,7 @@
           <w:sz w:val="22"/>
           <w:szCs w:val="22"/>
         </w:rPr>
-        <w:t xml:space="preserve">1-2　政経学部のアドミッション・ポリシー（要点）</w:t>
+        <w:t xml:space="preserve">1-2　政経学部のアドミッション・ポリシー（原文）</w:t>
       </w:r>
     </w:p>
     <w:tbl>
@@ -878,12 +878,7 @@
           </w:tcPr>
           <w:p>
             <w:pPr>
-              <w:pStyle w:val="ListParagraph"/>
-              <w:numPr>
-                <w:ilvl w:val="0"/>
-                <w:numId w:val="2"/>
-              </w:numPr>
-              <w:spacing w:after="40" w:line="300"/>
+              <w:spacing w:after="60" w:before="0" w:line="300"/>
             </w:pPr>
             <w:r>
               <w:rPr>
@@ -891,7 +886,7 @@
                 <w:sz w:val="21"/>
                 <w:szCs w:val="21"/>
               </w:rPr>
-              <w:t xml:space="preserve">法律学・政治学・経済学という社会科学の考え方を土台に、</w:t>
+              <w:t xml:space="preserve">政経学部は、法律学・政治学・経済学という社会科学の基盤的思考枠組みに立脚し、</w:t>
             </w:r>
             <w:r>
               <w:rPr>
@@ -901,7 +896,7 @@
                 <w:sz w:val="21"/>
                 <w:szCs w:val="21"/>
               </w:rPr>
-              <w:t xml:space="preserve">他者と協働しながら現場で課題に対処する意欲</w:t>
+              <w:t xml:space="preserve">現前する課題に他者と協働の上、現場の第一線で総合的かつ現実的見地から対処しようとする意欲</w:t>
             </w:r>
             <w:r>
               <w:rPr>
@@ -909,25 +904,7 @@
                 <w:sz w:val="21"/>
                 <w:szCs w:val="21"/>
               </w:rPr>
-              <w:t xml:space="preserve">のある人材を広く受け入れる。</w:t>
-            </w:r>
-          </w:p>
-          <w:p>
-            <w:pPr>
-              <w:pStyle w:val="ListParagraph"/>
-              <w:numPr>
-                <w:ilvl w:val="0"/>
-                <w:numId w:val="2"/>
-              </w:numPr>
-              <w:spacing w:after="40" w:line="300"/>
-            </w:pPr>
-            <w:r>
-              <w:rPr>
-                <w:rFonts w:ascii="游明朝" w:cs="游明朝" w:eastAsia="游明朝" w:hAnsi="游明朝"/>
-                <w:sz w:val="21"/>
-                <w:szCs w:val="21"/>
-              </w:rPr>
-              <w:t xml:space="preserve">高校で身につけるべき基礎知識に加え、</w:t>
+              <w:t xml:space="preserve">に溢れた人材を広く受け入れることを入学者受け入れの方針とし、高等学校で修得すべき基本的な知識に加え、</w:t>
             </w:r>
             <w:r>
               <w:rPr>
@@ -937,7 +914,7 @@
                 <w:sz w:val="21"/>
                 <w:szCs w:val="21"/>
               </w:rPr>
-              <w:t xml:space="preserve">グローバリゼーションへの関心</w:t>
+              <w:t xml:space="preserve">グローバリゼーションへの興味と論理的思考力</w:t>
             </w:r>
             <w:r>
               <w:rPr>
@@ -945,7 +922,7 @@
                 <w:sz w:val="21"/>
                 <w:szCs w:val="21"/>
               </w:rPr>
-              <w:t xml:space="preserve">・</w:t>
+              <w:t xml:space="preserve">を持ち、</w:t>
             </w:r>
             <w:r>
               <w:rPr>
@@ -955,7 +932,7 @@
                 <w:sz w:val="21"/>
                 <w:szCs w:val="21"/>
               </w:rPr>
-              <w:t xml:space="preserve">論理的思考力</w:t>
+              <w:t xml:space="preserve">国内外の社会現象への強い関心と行動力</w:t>
             </w:r>
             <w:r>
               <w:rPr>
@@ -963,7 +940,20 @@
                 <w:sz w:val="21"/>
                 <w:szCs w:val="21"/>
               </w:rPr>
-              <w:t xml:space="preserve">・</w:t>
+              <w:t xml:space="preserve">を持った人材を求める。</w:t>
+            </w:r>
+          </w:p>
+          <w:p>
+            <w:pPr>
+              <w:spacing w:after="0" w:before="0" w:line="300"/>
+            </w:pPr>
+            <w:r>
+              <w:rPr>
+                <w:rFonts w:ascii="游明朝" w:cs="游明朝" w:eastAsia="游明朝" w:hAnsi="游明朝"/>
+                <w:sz w:val="21"/>
+                <w:szCs w:val="21"/>
+              </w:rPr>
+              <w:t xml:space="preserve">そのため入学者の選抜においてはそれぞれの入試区分ごとに、出願書類審査、筆記試験、面接等の方法を単独または組み合わせて用い、学力水準や学修への意欲、学部が求める人材との適合性等を評価する。その際、高校時代の</w:t>
             </w:r>
             <w:r>
               <w:rPr>
@@ -973,7 +963,7 @@
                 <w:sz w:val="21"/>
                 <w:szCs w:val="21"/>
               </w:rPr>
-              <w:t xml:space="preserve">国内外の社会現象への関心と行動力</w:t>
+              <w:t xml:space="preserve">留学・ボランティア活動や、文化・芸術面の受賞歴</w:t>
             </w:r>
             <w:r>
               <w:rPr>
@@ -981,61 +971,7 @@
                 <w:sz w:val="21"/>
                 <w:szCs w:val="21"/>
               </w:rPr>
-              <w:t xml:space="preserve">を求める。</w:t>
-            </w:r>
-          </w:p>
-          <w:p>
-            <w:pPr>
-              <w:pStyle w:val="ListParagraph"/>
-              <w:numPr>
-                <w:ilvl w:val="0"/>
-                <w:numId w:val="2"/>
-              </w:numPr>
-              <w:spacing w:after="40" w:line="300"/>
-            </w:pPr>
-            <w:r>
-              <w:rPr>
-                <w:rFonts w:ascii="游明朝" w:cs="游明朝" w:eastAsia="游明朝" w:hAnsi="游明朝"/>
-                <w:sz w:val="21"/>
-                <w:szCs w:val="21"/>
-              </w:rPr>
-              <w:t xml:space="preserve">高校時代の</w:t>
-            </w:r>
-            <w:r>
-              <w:rPr>
-                <w:rFonts w:ascii="游明朝" w:cs="游明朝" w:eastAsia="游明朝" w:hAnsi="游明朝"/>
-                <w:b/>
-                <w:bCs/>
-                <w:sz w:val="21"/>
-                <w:szCs w:val="21"/>
-              </w:rPr>
-              <w:t xml:space="preserve">留学・ボランティア活動や、文化・芸術活動</w:t>
-            </w:r>
-            <w:r>
-              <w:rPr>
-                <w:rFonts w:ascii="游明朝" w:cs="游明朝" w:eastAsia="游明朝" w:hAnsi="游明朝"/>
-                <w:sz w:val="21"/>
-                <w:szCs w:val="21"/>
-              </w:rPr>
-              <w:t xml:space="preserve">などを評価の対象とする入試区分を設ける。</w:t>
-            </w:r>
-          </w:p>
-          <w:p>
-            <w:pPr>
-              <w:pStyle w:val="ListParagraph"/>
-              <w:numPr>
-                <w:ilvl w:val="0"/>
-                <w:numId w:val="2"/>
-              </w:numPr>
-              <w:spacing w:after="40" w:line="300"/>
-            </w:pPr>
-            <w:r>
-              <w:rPr>
-                <w:rFonts w:ascii="游明朝" w:cs="游明朝" w:eastAsia="游明朝" w:hAnsi="游明朝"/>
-                <w:sz w:val="21"/>
-                <w:szCs w:val="21"/>
-              </w:rPr>
-              <w:t xml:space="preserve">学部内に</w:t>
+              <w:t xml:space="preserve">を一定の評価の対象とする入試区分も設ける。また学部内に</w:t>
             </w:r>
             <w:r>
               <w:rPr>
@@ -1076,7 +1012,7 @@
           <w:sz w:val="22"/>
           <w:szCs w:val="22"/>
         </w:rPr>
-        <w:t xml:space="preserve">1-3　法律政治学科のアドミッション・ポリシー（要点）</w:t>
+        <w:t xml:space="preserve">1-3　法律政治学科のアドミッション・ポリシー（原文）</w:t>
       </w:r>
     </w:p>
     <w:tbl>
@@ -1154,7 +1090,7 @@
           </w:tcPr>
           <w:p>
             <w:pPr>
-              <w:spacing w:after="40" w:before="0" w:line="300"/>
+              <w:spacing w:after="0" w:before="0" w:line="290"/>
             </w:pPr>
             <w:r>
               <w:rPr>
@@ -1162,30 +1098,7 @@
                 <w:sz w:val="21"/>
                 <w:szCs w:val="21"/>
               </w:rPr>
-              <w:t xml:space="preserve">法律学・政治学の理論的・実践的知識を身につけ、グローバル化時代の実社会の諸問題を的確に指摘し、解決できる能力を修得する。</w:t>
-            </w:r>
-          </w:p>
-          <w:p>
-            <w:pPr>
-              <w:spacing w:after="0" w:before="0" w:line="300"/>
-            </w:pPr>
-            <w:r>
-              <w:rPr>
-                <w:rFonts w:ascii="游明朝" w:cs="游明朝" w:eastAsia="游明朝" w:hAnsi="游明朝"/>
-                <w:b/>
-                <w:bCs/>
-                <w:sz w:val="21"/>
-                <w:szCs w:val="21"/>
-              </w:rPr>
-              <w:t xml:space="preserve">活躍の場：</w:t>
-            </w:r>
-            <w:r>
-              <w:rPr>
-                <w:rFonts w:ascii="游明朝" w:cs="游明朝" w:eastAsia="游明朝" w:hAnsi="游明朝"/>
-                <w:sz w:val="21"/>
-                <w:szCs w:val="21"/>
-              </w:rPr>
-              <w:t xml:space="preserve">海外のほか、国内の政界・法曹界・国家公務員・地方公務員・出版やマスコミ等の民間部門</w:t>
+              <w:t xml:space="preserve">政経学部法律政治学科は、本学科の「卒業認定・学位授与の方針」及び「教育課程編成・実施の方針」を踏まえ、法律学・政治学分野における理論的・実践的知識を身につけ、グローバル化時代の実社会の諸問題を的確に指摘し、解決できる能力を修得し、海外雄飛のみならず、国内においても政界や法曹界、国家公務員や地方公務員、国際社会を視野に事業を展開する出版やマスコミ等の民間部門で、活躍する有為の人材を輩出することを目的とする。</w:t>
             </w:r>
           </w:p>
         </w:tc>
@@ -1329,7 +1242,7 @@
                 <w:sz w:val="21"/>
                 <w:szCs w:val="21"/>
               </w:rPr>
-              <w:t xml:space="preserve">法律学や政治学の学問領域を学修するために必要となる基礎的な学力や技能を身につけている。</w:t>
+              <w:t xml:space="preserve">法律学や政治学の学問領域を学修するために必要とする基礎的な学力や技能を身につけている。</w:t>
             </w:r>
           </w:p>
         </w:tc>
@@ -1393,12 +1306,7 @@
           </w:tcPr>
           <w:p>
             <w:pPr>
-              <w:pStyle w:val="ListParagraph"/>
-              <w:numPr>
-                <w:ilvl w:val="0"/>
-                <w:numId w:val="2"/>
-              </w:numPr>
-              <w:spacing w:after="40" w:line="300"/>
+              <w:spacing w:after="20" w:before="0" w:line="290"/>
             </w:pPr>
             <w:r>
               <w:rPr>
@@ -1406,18 +1314,21 @@
                 <w:sz w:val="21"/>
                 <w:szCs w:val="21"/>
               </w:rPr>
-              <w:t xml:space="preserve">高校までに身につけるべき基礎的な知識</w:t>
+              <w:t xml:space="preserve">①高等学校で修得すべき基本的知識を身につけている。</w:t>
             </w:r>
           </w:p>
           <w:p>
             <w:pPr>
-              <w:pStyle w:val="ListParagraph"/>
-              <w:numPr>
-                <w:ilvl w:val="0"/>
-                <w:numId w:val="2"/>
-              </w:numPr>
-              <w:spacing w:after="40" w:line="300"/>
+              <w:spacing w:after="20" w:before="0" w:line="290"/>
             </w:pPr>
+            <w:r>
+              <w:rPr>
+                <w:rFonts w:ascii="游明朝" w:cs="游明朝" w:eastAsia="游明朝" w:hAnsi="游明朝"/>
+                <w:sz w:val="21"/>
+                <w:szCs w:val="21"/>
+              </w:rPr>
+              <w:t xml:space="preserve">②</w:t>
+            </w:r>
             <w:r>
               <w:rPr>
                 <w:rFonts w:ascii="游明朝" w:cs="游明朝" w:eastAsia="游明朝" w:hAnsi="游明朝"/>
@@ -1426,7 +1337,7 @@
                 <w:sz w:val="21"/>
                 <w:szCs w:val="21"/>
               </w:rPr>
-              <w:t xml:space="preserve">グローバル化への関心</w:t>
+              <w:t xml:space="preserve">グローバリゼーションへの興味と論理的思考力</w:t>
             </w:r>
             <w:r>
               <w:rPr>
@@ -1434,7 +1345,20 @@
                 <w:sz w:val="21"/>
                 <w:szCs w:val="21"/>
               </w:rPr>
-              <w:t xml:space="preserve">と</w:t>
+              <w:t xml:space="preserve">を身につけている。</w:t>
+            </w:r>
+          </w:p>
+          <w:p>
+            <w:pPr>
+              <w:spacing w:after="20" w:before="0" w:line="290"/>
+            </w:pPr>
+            <w:r>
+              <w:rPr>
+                <w:rFonts w:ascii="游明朝" w:cs="游明朝" w:eastAsia="游明朝" w:hAnsi="游明朝"/>
+                <w:sz w:val="21"/>
+                <w:szCs w:val="21"/>
+              </w:rPr>
+              <w:t xml:space="preserve">③</w:t>
             </w:r>
             <w:r>
               <w:rPr>
@@ -1444,18 +1368,29 @@
                 <w:sz w:val="21"/>
                 <w:szCs w:val="21"/>
               </w:rPr>
-              <w:t xml:space="preserve">論理的思考力</w:t>
+              <w:t xml:space="preserve">国内外の社会現象への強い関心と行動力</w:t>
+            </w:r>
+            <w:r>
+              <w:rPr>
+                <w:rFonts w:ascii="游明朝" w:cs="游明朝" w:eastAsia="游明朝" w:hAnsi="游明朝"/>
+                <w:sz w:val="21"/>
+                <w:szCs w:val="21"/>
+              </w:rPr>
+              <w:t xml:space="preserve">を身につけている。</w:t>
             </w:r>
           </w:p>
           <w:p>
             <w:pPr>
-              <w:pStyle w:val="ListParagraph"/>
-              <w:numPr>
-                <w:ilvl w:val="0"/>
-                <w:numId w:val="2"/>
-              </w:numPr>
-              <w:spacing w:after="40" w:line="300"/>
+              <w:spacing w:after="0" w:before="0" w:line="290"/>
             </w:pPr>
+            <w:r>
+              <w:rPr>
+                <w:rFonts w:ascii="游明朝" w:cs="游明朝" w:eastAsia="游明朝" w:hAnsi="游明朝"/>
+                <w:sz w:val="21"/>
+                <w:szCs w:val="21"/>
+              </w:rPr>
+              <w:t xml:space="preserve">④</w:t>
+            </w:r>
             <w:r>
               <w:rPr>
                 <w:rFonts w:ascii="游明朝" w:cs="游明朝" w:eastAsia="游明朝" w:hAnsi="游明朝"/>
@@ -1464,7 +1399,7 @@
                 <w:sz w:val="21"/>
                 <w:szCs w:val="21"/>
               </w:rPr>
-              <w:t xml:space="preserve">国内外の社会現象への関心</w:t>
+              <w:t xml:space="preserve">地域社会やグローバル社会を支える志</w:t>
             </w:r>
             <w:r>
               <w:rPr>
@@ -1472,37 +1407,79 @@
                 <w:sz w:val="21"/>
                 <w:szCs w:val="21"/>
               </w:rPr>
-              <w:t xml:space="preserve">と</w:t>
-            </w:r>
-            <w:r>
-              <w:rPr>
-                <w:rFonts w:ascii="游明朝" w:cs="游明朝" w:eastAsia="游明朝" w:hAnsi="游明朝"/>
+              <w:t xml:space="preserve">を身につけている。</w:t>
+            </w:r>
+          </w:p>
+        </w:tc>
+      </w:tr>
+      <w:tr>
+        <w:trPr>
+          <w:cantSplit/>
+        </w:trPr>
+        <w:tc>
+          <w:tcPr>
+            <w:tcW w:type="dxa" w:w="2200"/>
+            <w:tcBorders>
+              <w:top w:val="single" w:color="1F4E79" w:sz="4"/>
+              <w:left w:val="single" w:color="1F4E79" w:sz="4"/>
+              <w:bottom w:val="single" w:color="1F4E79" w:sz="4"/>
+              <w:right w:val="single" w:color="1F4E79" w:sz="4"/>
+            </w:tcBorders>
+            <w:shd w:fill="1F4E79" w:color="auto" w:val="clear"/>
+            <w:tcMar>
+              <w:top w:type="dxa" w:w="80"/>
+              <w:left w:type="dxa" w:w="120"/>
+              <w:bottom w:type="dxa" w:w="80"/>
+              <w:right w:type="dxa" w:w="120"/>
+            </w:tcMar>
+            <w:vAlign w:val="center"/>
+          </w:tcPr>
+          <w:p>
+            <w:pPr>
+              <w:spacing w:after="0" w:before="0" w:line="320"/>
+              <w:jc w:val="center"/>
+            </w:pPr>
+            <w:r>
+              <w:rPr>
+                <w:rFonts w:ascii="游ゴシック" w:cs="游ゴシック" w:eastAsia="游ゴシック" w:hAnsi="游ゴシック"/>
                 <w:b/>
                 <w:bCs/>
-                <w:sz w:val="21"/>
-                <w:szCs w:val="21"/>
-              </w:rPr>
-              <w:t xml:space="preserve">行動力</w:t>
+                <w:color w:val="FFFFFF"/>
+                <w:sz w:val="19"/>
+                <w:szCs w:val="19"/>
+              </w:rPr>
+              <w:t xml:space="preserve">判定方法</w:t>
             </w:r>
           </w:p>
+        </w:tc>
+        <w:tc>
+          <w:tcPr>
+            <w:tcW w:type="dxa" w:w="8006"/>
+            <w:tcBorders>
+              <w:top w:val="single" w:color="1F4E79" w:sz="4"/>
+              <w:left w:val="single" w:color="1F4E79" w:sz="4"/>
+              <w:bottom w:val="single" w:color="1F4E79" w:sz="4"/>
+              <w:right w:val="single" w:color="1F4E79" w:sz="4"/>
+            </w:tcBorders>
+            <w:tcMar>
+              <w:top w:type="dxa" w:w="80"/>
+              <w:left w:type="dxa" w:w="120"/>
+              <w:bottom w:type="dxa" w:w="80"/>
+              <w:right w:type="dxa" w:w="120"/>
+            </w:tcMar>
+            <w:vAlign w:val="top"/>
+          </w:tcPr>
           <w:p>
             <w:pPr>
-              <w:pStyle w:val="ListParagraph"/>
-              <w:numPr>
-                <w:ilvl w:val="0"/>
-                <w:numId w:val="2"/>
-              </w:numPr>
-              <w:spacing w:after="40" w:line="300"/>
+              <w:spacing w:after="0" w:before="0" w:line="290"/>
             </w:pPr>
             <w:r>
               <w:rPr>
                 <w:rFonts w:ascii="游明朝" w:cs="游明朝" w:eastAsia="游明朝" w:hAnsi="游明朝"/>
-                <w:b/>
-                <w:bCs/>
-                <w:sz w:val="21"/>
-                <w:szCs w:val="21"/>
-              </w:rPr>
-              <w:t xml:space="preserve">地域社会やグローバル社会を支える志</w:t>
+                <w:sz w:val="19"/>
+                <w:szCs w:val="19"/>
+              </w:rPr>
+              <w:t xml:space="preserve">総合型選抜・学校推薦型選抜は、人物ならびに目的意識とそれを実現しうる学修意欲、学習歴及び能力を審査する面接・プレゼンテーション等に重点をおく。高等学校等で得た知識や体験、資格も審査の対象とする。</w:t>
             </w:r>
           </w:p>
         </w:tc>
@@ -1519,7 +1496,7 @@
           <w:sz w:val="17"/>
           <w:szCs w:val="17"/>
         </w:rPr>
-        <w:t xml:space="preserve">※ 拓殖大学 受験生サイト・政経学部サイトの掲載をもとにした要約です（2026年度入学者用）。最新の募集要項・拓殖大学受験生サイトで原文を確認しましょう。</w:t>
+        <w:t xml:space="preserve">※ 拓殖大学 受験生サイト「入学者受け入れの方針（アドミッション・ポリシー）」（2027年度入試用）、拓殖大学「教育方針」「政経学部 概要」「沿革」より。判定方法は外国人留学生に関する部分を省略。2026年10月18日確認。</w:t>
       </w:r>
     </w:p>
     <w:p>
@@ -1684,7 +1661,7 @@
                 <w:sz w:val="17"/>
                 <w:szCs w:val="17"/>
               </w:rPr>
-              <w:t xml:space="preserve">求められていること：積極進取の気概／あらゆる民族から敬慕される教養と品格／国内外の人と協働して問題を解決</w:t>
+              <w:t xml:space="preserve">求められていること：積極進取の気概／あらゆる民族から敬慕されるに値する教養と品格／国内外の人々と協働して課題の発見と解決にチャレンジ</w:t>
             </w:r>
           </w:p>
         </w:tc>
@@ -2078,7 +2055,7 @@
                 <w:sz w:val="17"/>
                 <w:szCs w:val="17"/>
               </w:rPr>
-              <w:t xml:space="preserve">求められていること：他者と協働しながら現場で課題に対処する意欲／留学・ボランティア・文化・芸術活動／多様な民族・文化への対応力</w:t>
+              <w:t xml:space="preserve">求められていること：現前する課題に他者と協働の上、現場の第一線で対処しようとする意欲／留学・ボランティア活動、文化・芸術面の受賞歴／多様な民族・文化への対応力</w:t>
             </w:r>
           </w:p>
         </w:tc>
@@ -2472,7 +2449,7 @@
                 <w:sz w:val="17"/>
                 <w:szCs w:val="17"/>
               </w:rPr>
-              <w:t xml:space="preserve">求められていること：法律学・政治学の知識で、実社会の諸問題を指摘し解決する／活躍の場：政界・法曹界・公務員・マスコミ等</w:t>
+              <w:t xml:space="preserve">求められていること：法律学・政治学分野の理論的・実践的知識で、グローバル化時代の実社会の諸問題を的確に指摘し、解決できる能力／活躍の場：政界・法曹界・国家公務員・地方公務員・出版やマスコミ等</w:t>
             </w:r>
           </w:p>
         </w:tc>
@@ -2866,7 +2843,7 @@
                 <w:sz w:val="17"/>
                 <w:szCs w:val="17"/>
               </w:rPr>
-              <w:t xml:space="preserve">求められていること：国語、英語、政治・経済や世界史等の社会科系科目を学習している</w:t>
+              <w:t xml:space="preserve">求められていること：高等学校等で国語、英語、政治・経済や世界史等の社会科系科目を学習している</w:t>
             </w:r>
           </w:p>
         </w:tc>
@@ -3260,7 +3237,7 @@
                 <w:sz w:val="17"/>
                 <w:szCs w:val="17"/>
               </w:rPr>
-              <w:t xml:space="preserve">求められていること：法律学や政治学を学ぶために必要な基礎的な学力や技能を身につけている</w:t>
+              <w:t xml:space="preserve">求められていること：法律学や政治学の学問領域を学修するために必要とする基礎的な学力や技能を身につけている</w:t>
             </w:r>
           </w:p>
         </w:tc>
@@ -3640,7 +3617,7 @@
                 <w:sz w:val="22"/>
                 <w:szCs w:val="22"/>
               </w:rPr>
-              <w:t xml:space="preserve">(3) 能力：グローバル化への関心と論理的思考力</w:t>
+              <w:t xml:space="preserve">(3) 能力②：グローバリゼーションへの興味と論理的思考力</w:t>
             </w:r>
           </w:p>
           <w:p>
@@ -3654,7 +3631,7 @@
                 <w:sz w:val="17"/>
                 <w:szCs w:val="17"/>
               </w:rPr>
-              <w:t xml:space="preserve">求められていること：国際的な問題に関心を持ち、筋道立てて考えられる</w:t>
+              <w:t xml:space="preserve">求められていること：グローバリゼーションへの興味と論理的思考力を身につけている</w:t>
             </w:r>
           </w:p>
         </w:tc>
@@ -4034,7 +4011,7 @@
                 <w:sz w:val="22"/>
                 <w:szCs w:val="22"/>
               </w:rPr>
-              <w:t xml:space="preserve">(3) 能力：社会現象への関心と行動力</w:t>
+              <w:t xml:space="preserve">(3) 能力③：国内外の社会現象への強い関心と行動力</w:t>
             </w:r>
           </w:p>
           <w:p>
@@ -4048,7 +4025,7 @@
                 <w:sz w:val="17"/>
                 <w:szCs w:val="17"/>
               </w:rPr>
-              <w:t xml:space="preserve">求められていること：国内外の社会の出来事に関心を持ち、行動に移せる</w:t>
+              <w:t xml:space="preserve">求められていること：国内外の社会現象への強い関心と行動力を身につけている</w:t>
             </w:r>
           </w:p>
         </w:tc>
@@ -4369,7 +4346,7 @@
                 <w:sz w:val="22"/>
                 <w:szCs w:val="22"/>
               </w:rPr>
-              <w:t xml:space="preserve">(3) 能力：地域社会・グローバル社会を支える志</w:t>
+              <w:t xml:space="preserve">(3) 能力④：地域社会やグローバル社会を支える志</w:t>
             </w:r>
           </w:p>
           <w:p>
@@ -4383,7 +4360,7 @@
                 <w:sz w:val="17"/>
                 <w:szCs w:val="17"/>
               </w:rPr>
-              <w:t xml:space="preserve">求められていること：地域や国際社会のために力を尽くそうとする志がある</w:t>
+              <w:t xml:space="preserve">求められていること：地域社会やグローバル社会を支える志を身につけている</w:t>
             </w:r>
           </w:p>
         </w:tc>
@@ -6481,7 +6458,7 @@
                 <w:sz w:val="20"/>
                 <w:szCs w:val="20"/>
               </w:rPr>
-              <w:t xml:space="preserve">建学の理念（積極進取・教養と品格・開拓の精神 など）に触れている</w:t>
+              <w:t xml:space="preserve">建学の理念（積極進取の気概・教養と品格・拓殖人材 など）に触れている</w:t>
             </w:r>
           </w:p>
         </w:tc>

</xml_diff>